<commit_message>
Switch master guide to clip-art style + per-element PNG / VideoScribe pipeline
- Replace the warm mid-century, outline-less style with a bright
  children's-book clip-art style on a new fixed brand palette
- Rewrite FULL/COMPACT style suffixes for isolated, transparent-background
  single-element generation
- Move from one composed 16:9 still per shot to per-frame element
  breakdowns, each element generated as its own transparent PNG
- Add Section 7 'Higgsfield Execution' (generate isolated element ->
  remove_background -> transparent PNG, optional SVG line version)
- Add Section 9 'VideoScribe Assembly' (animated hand draw-on reveal,
  frame by frame) and keep image-to-video clips as an optional motion path
- Update deliverables, folder structure (frames/frame_0NN/...), prompt
  pack, procedure, checklists, and appendix accordingly
- Regenerate PROJECT_MASTER_GUIDE.docx

https://claude.ai/code/session_012yrhJkQFRZkiQjmevywnos
</commit_message>
<xml_diff>
--- a/PROJECT_MASTER_GUIDE.docx
+++ b/PROJECT_MASTER_GUIDE.docx
@@ -107,7 +107,7 @@
         <w:rPr>
           <w:sz w:val="21"/>
         </w:rPr>
-        <w:t>Produce a HIGGSFIELD PROMPT PACK — paste-ready prompts that generate every image in the fixed style.</w:t>
+        <w:t>Produce a HIGGSFIELD PROMPT PACK — paste-ready prompts that generate every ELEMENT in the fixed style.</w:t>
       </w:r>
     </w:p>
     <w:p>
@@ -118,7 +118,7 @@
         <w:rPr>
           <w:sz w:val="21"/>
         </w:rPr>
-        <w:t>Generate the images (free in the Higgsfield web app on Seedream 4.5), name them to match the shots.</w:t>
+        <w:t>Generate each frame's elements as separate TRANSPARENT PNGs (Higgsfield + background removal), named per frame.</w:t>
       </w:r>
     </w:p>
     <w:p>
@@ -129,7 +129,7 @@
         <w:rPr>
           <w:sz w:val="21"/>
         </w:rPr>
-        <w:t>Assemble in a video editor (add VO, captions, camera moves), then publish.</w:t>
+        <w:t>Assemble in VideoScribe: the animated hand DRAWS each element on, frame by frame; add VO + captions, then publish.</w:t>
       </w:r>
     </w:p>
     <w:tbl>
@@ -181,7 +181,18 @@
         <w:rPr>
           <w:sz w:val="21"/>
         </w:rPr>
-        <w:t>A 10–15 min episode = ~150–300 shots/images.  Primary image model: Seedream 4.5.</w:t>
+        <w:t>A 10–15 min episode = ~150–300 frames; each frame = several isolated element PNGs drawn on in sequence.</w:t>
+      </w:r>
+    </w:p>
+    <w:p>
+      <w:pPr>
+        <w:pStyle w:val="ListBullet"/>
+      </w:pPr>
+      <w:r>
+        <w:rPr>
+          <w:sz w:val="21"/>
+        </w:rPr>
+        <w:t>Primary image model: Seedream 4.5.  Assembly + motion: VideoScribe animated hand-reveal.</w:t>
       </w:r>
     </w:p>
     <w:p>
@@ -361,7 +372,39 @@
                 <w:b w:val="0"/>
                 <w:sz w:val="18"/>
               </w:rPr>
-              <w:t>The approved cartoon look (flat mid-century explainer style) — see Section 4.</w:t>
+              <w:t>The approved cartoon look (bright children's-book clip-art) — see Section 4.</w:t>
+            </w:r>
+          </w:p>
+        </w:tc>
+      </w:tr>
+      <w:tr>
+        <w:tc>
+          <w:tcPr>
+            <w:tcW w:type="dxa" w:w="4320"/>
+          </w:tcPr>
+          <w:p>
+            <w:r/>
+            <w:r>
+              <w:rPr>
+                <w:b/>
+                <w:sz w:val="18"/>
+              </w:rPr>
+              <w:t>VideoScribe (Sparkol)</w:t>
+            </w:r>
+          </w:p>
+        </w:tc>
+        <w:tc>
+          <w:tcPr>
+            <w:tcW w:type="dxa" w:w="4320"/>
+          </w:tcPr>
+          <w:p>
+            <w:r/>
+            <w:r>
+              <w:rPr>
+                <w:b w:val="0"/>
+                <w:sz w:val="18"/>
+              </w:rPr>
+              <w:t>THE ASSEMBLY TOOL. The animated hand draws each element PNG onto a 16:9 canvas, frame by frame, to build the video (see the VideoScribe Assembly section).</w:t>
             </w:r>
           </w:p>
         </w:tc>
@@ -623,7 +666,7 @@
                 <w:color w:val="8A4B16"/>
                 <w:sz w:val="20"/>
               </w:rPr>
-              <w:t>Mandatory and unchanging. Every image in every episode matches this. Append the style tag (Section 6 / Appendix) to every Higgsfield prompt.</w:t>
+              <w:t>Mandatory and unchanging. Every element in every episode matches this. Append the style tag (Section 6 / Appendix) to every Higgsfield prompt. Every element is generated ISOLATED on a transparent background.</w:t>
             </w:r>
           </w:p>
         </w:tc>
@@ -636,7 +679,7 @@
           <w:i w:val="0"/>
           <w:sz w:val="21"/>
         </w:rPr>
-        <w:t>One sentence: warm, friendly, FLAT 2D vector illustration in a mid-century-modern 'explainer animation' style — bold simple shapes, a tight cozy palette, no harsh outlines, flat lighting, and a subtle grain texture.</w:t>
+        <w:t>One sentence: bright, cheerful, wholesome FLAT 2D vector children's-book CLIP-ART — rounded cute friendly characters and objects, clean simple shapes, soft subtle shading with gentle highlights, thin minimal edge accents (no heavy black outlines), dot eyes and rosy cheeks; every asset a SINGLE isolated element on a transparent background.</w:t>
       </w:r>
     </w:p>
     <w:p>
@@ -655,7 +698,7 @@
         <w:rPr>
           <w:sz w:val="21"/>
         </w:rPr>
-        <w:t>FLAT color only — no gradients, no realistic shading, no 3D, no gloss.</w:t>
+        <w:t>CLIP-ART, ISOLATED — one element per asset, centered, on a TRANSPARENT background (no scene, no ground shadow).</w:t>
       </w:r>
     </w:p>
     <w:p>
@@ -666,7 +709,7 @@
         <w:rPr>
           <w:sz w:val="21"/>
         </w:rPr>
-        <w:t>SHAPE-FIRST — circles, ovals, rounded rectangles; chunky, friendly, stable.</w:t>
+        <w:t>ROUNDED &amp; CUTE — chunky friendly proportions; circles, ovals, soft rounded shapes.</w:t>
       </w:r>
     </w:p>
     <w:p>
@@ -677,7 +720,7 @@
         <w:rPr>
           <w:sz w:val="21"/>
         </w:rPr>
-        <w:t>OUTLINE-LESS — forms separated by color, not black ink lines.</w:t>
+        <w:t>SOFT SHADING + HIGHLIGHTS — gentle subtle shading and soft highlights for a little depth (not flat-only, not 3D).</w:t>
       </w:r>
     </w:p>
     <w:p>
@@ -688,7 +731,7 @@
         <w:rPr>
           <w:sz w:val="21"/>
         </w:rPr>
-        <w:t>WARM LIMITED PALETTE (below); nothing neon.</w:t>
+        <w:t>THIN MINIMAL EDGE ACCENTS — light darker edges only where shapes need separation; NO heavy black ink outlines.</w:t>
       </w:r>
     </w:p>
     <w:p>
@@ -699,7 +742,7 @@
         <w:rPr>
           <w:sz w:val="21"/>
         </w:rPr>
-        <w:t>FLAT SOFT LIGHTING — gentle ambient; soft flat low-opacity shadows.</w:t>
+        <w:t>BRIGHT MULTICOLOR BRAND PALETTE (below) — cheerful and saturated, but fixed for series consistency.</w:t>
       </w:r>
     </w:p>
     <w:p>
@@ -710,7 +753,7 @@
         <w:rPr>
           <w:sz w:val="21"/>
         </w:rPr>
-        <w:t>GRAIN — a subtle film/paper texture over the whole frame.</w:t>
+        <w:t>FRIENDLY FACES — small dot eyes, rosy cheek blush, simple happy expressions.</w:t>
       </w:r>
     </w:p>
     <w:p>
@@ -721,26 +764,15 @@
         <w:rPr>
           <w:sz w:val="21"/>
         </w:rPr>
-        <w:t>SIMPLE FACES — dot eyes, minimal mouths; emotion via eyebrows + posture.</w:t>
+        <w:t>CLEAN &amp; WHOLESOME — uncluttered, modern, no grain, no texture overlays.</w:t>
       </w:r>
     </w:p>
     <w:p>
       <w:pPr>
-        <w:pStyle w:val="ListBullet"/>
+        <w:pStyle w:val="Heading2"/>
       </w:pPr>
       <w:r>
-        <w:rPr>
-          <w:sz w:val="21"/>
-        </w:rPr>
-        <w:t>COZY &amp; UNCLUTTERED — simple props, generous negative space.</w:t>
-      </w:r>
-    </w:p>
-    <w:p>
-      <w:pPr>
-        <w:pStyle w:val="Heading2"/>
-      </w:pPr>
-      <w:r>
-        <w:t>4b. Color palette (canonical hex)</w:t>
+        <w:t>4b. Color palette (canonical brand hex)</w:t>
       </w:r>
     </w:p>
     <w:tbl>
@@ -829,7 +861,7 @@
         <w:tc>
           <w:tcPr>
             <w:tcW w:type="dxa" w:w="720"/>
-            <w:shd w:val="clear" w:color="auto" w:fill="E8A93C"/>
+            <w:shd w:val="clear" w:color="auto" w:fill="FBC02D"/>
           </w:tcPr>
           <w:p>
             <w:r/>
@@ -852,7 +884,7 @@
                 <w:b/>
                 <w:sz w:val="17"/>
               </w:rPr>
-              <w:t>Ochre Yellow</w:t>
+              <w:t>Sunshine Yellow</w:t>
             </w:r>
           </w:p>
         </w:tc>
@@ -867,7 +899,7 @@
                 <w:b w:val="0"/>
                 <w:sz w:val="17"/>
               </w:rPr>
-              <w:t>#E8A93C</w:t>
+              <w:t>#FBC02D</w:t>
             </w:r>
           </w:p>
         </w:tc>
@@ -882,7 +914,7 @@
                 <w:b w:val="0"/>
                 <w:sz w:val="17"/>
               </w:rPr>
-              <w:t>Backgrounds / large warm fields</w:t>
+              <w:t>Beaks, manes, warm highlights</w:t>
             </w:r>
           </w:p>
         </w:tc>
@@ -891,7 +923,7 @@
         <w:tc>
           <w:tcPr>
             <w:tcW w:type="dxa" w:w="720"/>
-            <w:shd w:val="clear" w:color="auto" w:fill="F7EAD0"/>
+            <w:shd w:val="clear" w:color="auto" w:fill="4FC3E8"/>
           </w:tcPr>
           <w:p>
             <w:r/>
@@ -914,7 +946,7 @@
                 <w:b/>
                 <w:sz w:val="17"/>
               </w:rPr>
-              <w:t>Warm Cream</w:t>
+              <w:t>Sky Blue</w:t>
             </w:r>
           </w:p>
         </w:tc>
@@ -929,7 +961,7 @@
                 <w:b w:val="0"/>
                 <w:sz w:val="17"/>
               </w:rPr>
-              <w:t>#F7EAD0</w:t>
+              <w:t>#4FC3E8</w:t>
             </w:r>
           </w:p>
         </w:tc>
@@ -944,7 +976,7 @@
                 <w:b w:val="0"/>
                 <w:sz w:val="17"/>
               </w:rPr>
-              <w:t>Light backgrounds, negative space</w:t>
+              <w:t>Water/sky elements, calm characters</w:t>
             </w:r>
           </w:p>
         </w:tc>
@@ -953,7 +985,7 @@
         <w:tc>
           <w:tcPr>
             <w:tcW w:type="dxa" w:w="720"/>
-            <w:shd w:val="clear" w:color="auto" w:fill="3C7C9A"/>
+            <w:shd w:val="clear" w:color="auto" w:fill="7CC576"/>
           </w:tcPr>
           <w:p>
             <w:r/>
@@ -976,7 +1008,7 @@
                 <w:b/>
                 <w:sz w:val="17"/>
               </w:rPr>
-              <w:t>Teal Blue</w:t>
+              <w:t>Leaf Green</w:t>
             </w:r>
           </w:p>
         </w:tc>
@@ -991,7 +1023,7 @@
                 <w:b w:val="0"/>
                 <w:sz w:val="17"/>
               </w:rPr>
-              <w:t>#3C7C9A</w:t>
+              <w:t>#7CC576</w:t>
             </w:r>
           </w:p>
         </w:tc>
@@ -1006,7 +1038,7 @@
                 <w:b w:val="0"/>
                 <w:sz w:val="17"/>
               </w:rPr>
-              <w:t>Main character bodies, calm zones</w:t>
+              <w:t>Foliage, ground shapes</w:t>
             </w:r>
           </w:p>
         </w:tc>
@@ -1015,7 +1047,7 @@
         <w:tc>
           <w:tcPr>
             <w:tcW w:type="dxa" w:w="720"/>
-            <w:shd w:val="clear" w:color="auto" w:fill="21465A"/>
+            <w:shd w:val="clear" w:color="auto" w:fill="F0654E"/>
           </w:tcPr>
           <w:p>
             <w:r/>
@@ -1038,7 +1070,7 @@
                 <w:b/>
                 <w:sz w:val="17"/>
               </w:rPr>
-              <w:t>Deep Navy</w:t>
+              <w:t>Tomato Coral</w:t>
             </w:r>
           </w:p>
         </w:tc>
@@ -1053,69 +1085,7 @@
                 <w:b w:val="0"/>
                 <w:sz w:val="17"/>
               </w:rPr>
-              <w:t>#21465A</w:t>
-            </w:r>
-          </w:p>
-        </w:tc>
-        <w:tc>
-          <w:tcPr>
-            <w:tcW w:type="dxa" w:w="4752"/>
-          </w:tcPr>
-          <w:p>
-            <w:r/>
-            <w:r>
-              <w:rPr>
-                <w:b w:val="0"/>
-                <w:sz w:val="17"/>
-              </w:rPr>
-              <w:t>Depth, dark accents, grounding</w:t>
-            </w:r>
-          </w:p>
-        </w:tc>
-      </w:tr>
-      <w:tr>
-        <w:tc>
-          <w:tcPr>
-            <w:tcW w:type="dxa" w:w="720"/>
-            <w:shd w:val="clear" w:color="auto" w:fill="EF5A2A"/>
-          </w:tcPr>
-          <w:p>
-            <w:r/>
-            <w:r>
-              <w:rPr>
-                <w:b w:val="0"/>
-                <w:sz w:val="17"/>
-              </w:rPr>
-            </w:r>
-          </w:p>
-        </w:tc>
-        <w:tc>
-          <w:tcPr>
-            <w:tcW w:type="dxa" w:w="2160"/>
-          </w:tcPr>
-          <w:p>
-            <w:r/>
-            <w:r>
-              <w:rPr>
-                <w:b/>
-                <w:sz w:val="17"/>
-              </w:rPr>
-              <w:t>Coral Red-Orange</w:t>
-            </w:r>
-          </w:p>
-        </w:tc>
-        <w:tc>
-          <w:tcPr>
-            <w:tcW w:type="dxa" w:w="1296"/>
-          </w:tcPr>
-          <w:p>
-            <w:r/>
-            <w:r>
-              <w:rPr>
-                <w:b w:val="0"/>
-                <w:sz w:val="17"/>
-              </w:rPr>
-              <w:t>#EF5A2A</w:t>
+              <w:t>#F0654E</w:t>
             </w:r>
           </w:p>
         </w:tc>
@@ -1139,7 +1109,7 @@
         <w:tc>
           <w:tcPr>
             <w:tcW w:type="dxa" w:w="720"/>
-            <w:shd w:val="clear" w:color="auto" w:fill="CC6B2C"/>
+            <w:shd w:val="clear" w:color="auto" w:fill="F39237"/>
           </w:tcPr>
           <w:p>
             <w:r/>
@@ -1162,7 +1132,7 @@
                 <w:b/>
                 <w:sz w:val="17"/>
               </w:rPr>
-              <w:t>Burnt Orange</w:t>
+              <w:t>Tangerine</w:t>
             </w:r>
           </w:p>
         </w:tc>
@@ -1177,7 +1147,7 @@
                 <w:b w:val="0"/>
                 <w:sz w:val="17"/>
               </w:rPr>
-              <w:t>#CC6B2C</w:t>
+              <w:t>#F39237</w:t>
             </w:r>
           </w:p>
         </w:tc>
@@ -1192,7 +1162,7 @@
                 <w:b w:val="0"/>
                 <w:sz w:val="17"/>
               </w:rPr>
-              <w:t>Plants, warm secondary accents</w:t>
+              <w:t>Secondary warm accent (lion/monkey)</w:t>
             </w:r>
           </w:p>
         </w:tc>
@@ -1201,7 +1171,7 @@
         <w:tc>
           <w:tcPr>
             <w:tcW w:type="dxa" w:w="720"/>
-            <w:shd w:val="clear" w:color="auto" w:fill="A7A24A"/>
+            <w:shd w:val="clear" w:color="auto" w:fill="F6A9B6"/>
           </w:tcPr>
           <w:p>
             <w:r/>
@@ -1224,7 +1194,7 @@
                 <w:b/>
                 <w:sz w:val="17"/>
               </w:rPr>
-              <w:t>Moss Olive</w:t>
+              <w:t>Blush Pink</w:t>
             </w:r>
           </w:p>
         </w:tc>
@@ -1239,7 +1209,7 @@
                 <w:b w:val="0"/>
                 <w:sz w:val="17"/>
               </w:rPr>
-              <w:t>#A7A24A</w:t>
+              <w:t>#F6A9B6</w:t>
             </w:r>
           </w:p>
         </w:tc>
@@ -1254,7 +1224,7 @@
                 <w:b w:val="0"/>
                 <w:sz w:val="17"/>
               </w:rPr>
-              <w:t>Foliage, variety</w:t>
+              <w:t>Cheek blush, soft accents</w:t>
             </w:r>
           </w:p>
         </w:tc>
@@ -1263,7 +1233,7 @@
         <w:tc>
           <w:tcPr>
             <w:tcW w:type="dxa" w:w="720"/>
-            <w:shd w:val="clear" w:color="auto" w:fill="FCF6EA"/>
+            <w:shd w:val="clear" w:color="auto" w:fill="9DB0BC"/>
           </w:tcPr>
           <w:p>
             <w:r/>
@@ -1286,7 +1256,7 @@
                 <w:b/>
                 <w:sz w:val="17"/>
               </w:rPr>
-              <w:t>Off-White</w:t>
+              <w:t>Stone Gray</w:t>
             </w:r>
           </w:p>
         </w:tc>
@@ -1301,7 +1271,7 @@
                 <w:b w:val="0"/>
                 <w:sz w:val="17"/>
               </w:rPr>
-              <w:t>#FCF6EA</w:t>
+              <w:t>#9DB0BC</w:t>
             </w:r>
           </w:p>
         </w:tc>
@@ -1316,7 +1286,7 @@
                 <w:b w:val="0"/>
                 <w:sz w:val="17"/>
               </w:rPr>
-              <w:t>Highlights, eye whites</w:t>
+              <w:t>Elephant/rhino bodies, neutral props</w:t>
             </w:r>
           </w:p>
         </w:tc>
@@ -1325,7 +1295,131 @@
         <w:tc>
           <w:tcPr>
             <w:tcW w:type="dxa" w:w="720"/>
-            <w:shd w:val="clear" w:color="auto" w:fill="2C2A29"/>
+            <w:shd w:val="clear" w:color="auto" w:fill="8D6E63"/>
+          </w:tcPr>
+          <w:p>
+            <w:r/>
+            <w:r>
+              <w:rPr>
+                <w:b w:val="0"/>
+                <w:sz w:val="17"/>
+              </w:rPr>
+            </w:r>
+          </w:p>
+        </w:tc>
+        <w:tc>
+          <w:tcPr>
+            <w:tcW w:type="dxa" w:w="2160"/>
+          </w:tcPr>
+          <w:p>
+            <w:r/>
+            <w:r>
+              <w:rPr>
+                <w:b/>
+                <w:sz w:val="17"/>
+              </w:rPr>
+              <w:t>Warm Brown</w:t>
+            </w:r>
+          </w:p>
+        </w:tc>
+        <w:tc>
+          <w:tcPr>
+            <w:tcW w:type="dxa" w:w="1296"/>
+          </w:tcPr>
+          <w:p>
+            <w:r/>
+            <w:r>
+              <w:rPr>
+                <w:b w:val="0"/>
+                <w:sz w:val="17"/>
+              </w:rPr>
+              <w:t>#8D6E63</w:t>
+            </w:r>
+          </w:p>
+        </w:tc>
+        <w:tc>
+          <w:tcPr>
+            <w:tcW w:type="dxa" w:w="4752"/>
+          </w:tcPr>
+          <w:p>
+            <w:r/>
+            <w:r>
+              <w:rPr>
+                <w:b w:val="0"/>
+                <w:sz w:val="17"/>
+              </w:rPr>
+              <w:t>Trunks, wood, branches</w:t>
+            </w:r>
+          </w:p>
+        </w:tc>
+      </w:tr>
+      <w:tr>
+        <w:tc>
+          <w:tcPr>
+            <w:tcW w:type="dxa" w:w="720"/>
+            <w:shd w:val="clear" w:color="auto" w:fill="FBF7EF"/>
+          </w:tcPr>
+          <w:p>
+            <w:r/>
+            <w:r>
+              <w:rPr>
+                <w:b w:val="0"/>
+                <w:sz w:val="17"/>
+              </w:rPr>
+            </w:r>
+          </w:p>
+        </w:tc>
+        <w:tc>
+          <w:tcPr>
+            <w:tcW w:type="dxa" w:w="2160"/>
+          </w:tcPr>
+          <w:p>
+            <w:r/>
+            <w:r>
+              <w:rPr>
+                <w:b/>
+                <w:sz w:val="17"/>
+              </w:rPr>
+              <w:t>Cream</w:t>
+            </w:r>
+          </w:p>
+        </w:tc>
+        <w:tc>
+          <w:tcPr>
+            <w:tcW w:type="dxa" w:w="1296"/>
+          </w:tcPr>
+          <w:p>
+            <w:r/>
+            <w:r>
+              <w:rPr>
+                <w:b w:val="0"/>
+                <w:sz w:val="17"/>
+              </w:rPr>
+              <w:t>#FBF7EF</w:t>
+            </w:r>
+          </w:p>
+        </w:tc>
+        <w:tc>
+          <w:tcPr>
+            <w:tcW w:type="dxa" w:w="4752"/>
+          </w:tcPr>
+          <w:p>
+            <w:r/>
+            <w:r>
+              <w:rPr>
+                <w:b w:val="0"/>
+                <w:sz w:val="17"/>
+              </w:rPr>
+              <w:t>VideoScribe canvas / negative space</w:t>
+            </w:r>
+          </w:p>
+        </w:tc>
+      </w:tr>
+      <w:tr>
+        <w:tc>
+          <w:tcPr>
+            <w:tcW w:type="dxa" w:w="720"/>
+            <w:shd w:val="clear" w:color="auto" w:fill="3A3631"/>
           </w:tcPr>
           <w:p>
             <w:r/>
@@ -1363,7 +1457,7 @@
                 <w:b w:val="0"/>
                 <w:sz w:val="17"/>
               </w:rPr>
-              <w:t>#2C2A29</w:t>
+              <w:t>#3A3631</w:t>
             </w:r>
           </w:p>
         </w:tc>
@@ -1378,7 +1472,7 @@
                 <w:b w:val="0"/>
                 <w:sz w:val="17"/>
               </w:rPr>
-              <w:t>Eyes / fine details only — never pure black</w:t>
+              <w:t>Eyes / edge accents / fine detail — never pure black</w:t>
             </w:r>
           </w:p>
         </w:tc>
@@ -1393,7 +1487,7 @@
         <w:rPr>
           <w:sz w:val="21"/>
         </w:rPr>
-        <w:t>60/30/10: ~60% warm neutrals, ~30% blues, ~10% coral accent. Coral marks what to look at. No pure black/white.</w:t>
+        <w:t>Bright but balanced: use the palette across elements; reserve TOMATO CORAL for the one focal element per frame (the key idea). Cream is the canvas. No pure black/white.</w:t>
       </w:r>
     </w:p>
     <w:p>
@@ -1412,7 +1506,7 @@
         <w:rPr>
           <w:sz w:val="21"/>
         </w:rPr>
-        <w:t>HOST (recurring narrator): one fixed friendly animal guide — recommended a rounded teal fox with a signature coral scarf and dot eyes — in every episode. Lock ONE design and reuse it identically.</w:t>
+        <w:t>HOST (recurring narrator): one fixed friendly clip-art animal guide — recommended a rounded sky-blue fox with a coral scarf, dot eyes and rosy cheeks. Lock ONE design and reuse it identically as a saved Element.</w:t>
       </w:r>
     </w:p>
     <w:p>
@@ -1423,7 +1517,7 @@
         <w:rPr>
           <w:sz w:val="21"/>
         </w:rPr>
-        <w:t>ANIMAL OF THE WEEK: the spreadsheet animal, RE-TINTED into the palette (not natural photo colors), simplified.</w:t>
+        <w:t>ANIMAL OF THE WEEK: the spreadsheet animal as a cute rounded clip-art character, RE-TINTED into the brand palette (not natural photo colors), simplified, friendly.</w:t>
       </w:r>
     </w:p>
     <w:p>
@@ -1434,7 +1528,7 @@
         <w:rPr>
           <w:sz w:val="21"/>
         </w:rPr>
-        <w:t>CROWDS / MARKETS / 'YOU': simple rounded humanoid figures in palette colors; the odd-one-out is coral.</w:t>
+        <w:t>CROWDS / MARKETS / 'YOU': simple rounded clip-art figures in palette colors; the odd-one-out is coral.</w:t>
       </w:r>
     </w:p>
     <w:p>
@@ -1453,7 +1547,7 @@
         <w:rPr>
           <w:sz w:val="21"/>
         </w:rPr>
-        <w:t>Charts/coins/arrows drawn flat &amp; chunky in palette (no realistic stock screenshots). Keep one icon vocabulary.</w:t>
+        <w:t>Charts/coins/arrows drawn as cute chunky clip-art in the palette (no realistic stock screenshots). Keep one icon vocabulary. Each is its OWN isolated transparent element.</w:t>
       </w:r>
     </w:p>
     <w:p>
@@ -1464,7 +1558,7 @@
         <w:rPr>
           <w:sz w:val="21"/>
         </w:rPr>
-        <w:t>16:9 every frame; one clear subject; keep bottom ~15% caption-safe; vary shot scale across a sequence.</w:t>
+        <w:t>Elements are individual assets (no fixed aspect ratio on the PNG). The 16:9 LAYOUT is composed on the VideoScribe canvas; one clear focal subject per frame; keep the bottom ~15% of the canvas caption-safe.</w:t>
       </w:r>
     </w:p>
     <w:p>
@@ -1481,7 +1575,7 @@
           <w:i w:val="0"/>
           <w:sz w:val="21"/>
         </w:rPr>
-        <w:t>For each row, produce THREE linked deliverables (Shot 001 ↔ Prompt 001 ↔ shot_001.png):</w:t>
+        <w:t>For each row, produce THREE linked deliverables (Frame 001 ↔ its element prompts ↔ frame_001/ element PNGs):</w:t>
       </w:r>
     </w:p>
     <w:p>
@@ -1492,7 +1586,7 @@
         <w:rPr>
           <w:sz w:val="21"/>
         </w:rPr>
-        <w:t>DELIVERABLE A — SHOT LIST (Word doc): header meta + clean narration script + a table of timed shots (Shot #, timestamp, narration slice, one-line visual, file name, STILL/CLIP, prompt #).</w:t>
+        <w:t>DELIVERABLE A — SHOT LIST (Word doc): header meta + clean narration script + a table of timed FRAMES (Frame #, timestamp, narration slice, one-line visual, ELEMENT BREAKDOWN, draw order, prompt #s, STILL/CLIP).</w:t>
       </w:r>
     </w:p>
     <w:p>
@@ -1503,7 +1597,7 @@
         <w:rPr>
           <w:sz w:val="21"/>
         </w:rPr>
-        <w:t>DELIVERABLE B — HIGGSFIELD PROMPT PACK (text): a consistency header + one paste-ready prompt per shot (Section 6).</w:t>
+        <w:t>DELIVERABLE B — HIGGSFIELD PROMPT PACK (text): a consistency header + per-ELEMENT prompts grouped by frame (Section 6) — one paste-ready prompt for each isolated element.</w:t>
       </w:r>
     </w:p>
     <w:p>
@@ -1514,7 +1608,7 @@
         <w:rPr>
           <w:sz w:val="21"/>
         </w:rPr>
-        <w:t>DELIVERABLE C — IMAGE FOLDER: the images, produced by running the Prompt Pack (free in the web app, or via API at credit cost), named shot_001.png … shot_0NN.png.</w:t>
+        <w:t>DELIVERABLE C — FRAMES FOLDER: for each frame, every element as a TRANSPARENT PNG, produced by running the Prompt Pack + background removal, named frame_0NN_elXX_&lt;name&gt;.png inside frames/frame_0NN/.</w:t>
       </w:r>
     </w:p>
     <w:p>
@@ -1522,7 +1616,7 @@
         <w:pStyle w:val="Heading2"/>
       </w:pPr>
       <w:r>
-        <w:t>5a. Timing method (every shot = 3–5 seconds)</w:t>
+        <w:t>5a. Timing method (every frame = 3–5 seconds)</w:t>
       </w:r>
     </w:p>
     <w:p>
@@ -1555,7 +1649,7 @@
         <w:rPr>
           <w:sz w:val="21"/>
         </w:rPr>
-        <w:t>Segment into shots of 3–5s each (~8–13 words = one short clause), one IMAGE per shot.</w:t>
+        <w:t>Segment into frames of 3–5s each (~8–13 words = one short clause), one on-screen scene per frame.</w:t>
       </w:r>
     </w:p>
     <w:p>
@@ -1566,7 +1660,7 @@
         <w:rPr>
           <w:sz w:val="21"/>
         </w:rPr>
-        <w:t>Assign cumulative timestamps (shot length = its_words ÷ 2.5).</w:t>
+        <w:t>List each frame's ELEMENTS and the order the hand draws them; assign cumulative timestamps (frame length = its_words ÷ 2.5). The frame's elements are drawn on in sequence across its narration slice.</w:t>
       </w:r>
     </w:p>
     <w:tbl>
@@ -1592,7 +1686,7 @@
                 <w:color w:val="8A4B16"/>
                 <w:sz w:val="20"/>
               </w:rPr>
-              <w:t>RESULT: a 10–15 min episode → ~150–300 shots/images. Use the key-frame + editor approach (Section 7) to hit the 3–5s cadence WITHOUT generating a separate image for literally every shot.</w:t>
+              <w:t>RESULT: a 10–15 min episode → ~150–300 frames, each composed of a few isolated element PNGs. Reuse saved ELEMENTS (Host, recurring props) across frames so you don't regenerate the same asset every time.</w:t>
             </w:r>
           </w:p>
         </w:tc>
@@ -1641,13 +1735,19 @@
               </w:rPr>
               <w:t>EP07_risk-pooling_vampire-bat/</w:t>
               <w:br/>
-              <w:t xml:space="preserve">    EP07_shot-list.docx          &lt;- Deliverable A</w:t>
+              <w:t xml:space="preserve">    EP07_shot-list.docx            &lt;- Deliverable A</w:t>
               <w:br/>
-              <w:t xml:space="preserve">    EP07_prompt-pack.txt         &lt;- Deliverable B</w:t>
+              <w:t xml:space="preserve">    EP07_prompt-pack.txt           &lt;- Deliverable B</w:t>
               <w:br/>
-              <w:t xml:space="preserve">    images/  shot_001.png … shot_0NN.png   &lt;- Deliverable C</w:t>
+              <w:t xml:space="preserve">    frames/                        &lt;- Deliverable C (transparent element PNGs)</w:t>
               <w:br/>
-              <w:t xml:space="preserve">    clips/   shot_0XX.mp4        &lt;- only if any CLIP shots</w:t>
+              <w:t xml:space="preserve">        frame_001/  frame_001_el01_&lt;name&gt;.png  frame_001_el02_&lt;name&gt;.png ...</w:t>
+              <w:br/>
+              <w:t xml:space="preserve">        frame_002/  ...</w:t>
+              <w:br/>
+              <w:t xml:space="preserve">    videoscribe/  EP07.scribe      &lt;- the VideoScribe assembly project</w:t>
+              <w:br/>
+              <w:t xml:space="preserve">    clips/   frame_0XX.mp4         &lt;- OPTIONAL image-to-video for special motion</w:t>
             </w:r>
           </w:p>
         </w:tc>
@@ -1668,7 +1768,7 @@
           <w:i w:val="0"/>
           <w:sz w:val="21"/>
         </w:rPr>
-        <w:t>After the shot list, ALWAYS output the Prompt Pack: the exact prompts the user pastes into the Higgsfield web app to generate the episode's images consistently. Two parts:</w:t>
+        <w:t>After the shot list, ALWAYS output the Prompt Pack: the exact prompts the user pastes into the Higgsfield web app to generate the episode's ELEMENTS consistently. Each frame becomes a small group of element prompts. Two parts:</w:t>
       </w:r>
     </w:p>
     <w:p>
@@ -1709,7 +1809,7 @@
         <w:rPr>
           <w:sz w:val="21"/>
         </w:rPr>
-        <w:t>WORLD/SET BIBLE: the recurring environment(s), described identically.</w:t>
+        <w:t>PROP/MOTIF BIBLE: the recurring props and finance motifs (coins, charts, arrows), described identically.</w:t>
       </w:r>
     </w:p>
     <w:p>
@@ -1720,7 +1820,7 @@
         <w:rPr>
           <w:sz w:val="21"/>
         </w:rPr>
-        <w:t>PALETTE hex list + SETTINGS (Seedream 4.5, 16:9, attach style key-frame as reference + Host Element, one seed per shot-family).</w:t>
+        <w:t>PALETTE hex list + SETTINGS (Seedream 4.5, attach style key-frame as reference + Host Element, one seed per character/prop, ISOLATED element on a plain background → remove background to a transparent PNG).</w:t>
       </w:r>
     </w:p>
     <w:p>
@@ -1728,7 +1828,7 @@
         <w:pStyle w:val="Heading2"/>
       </w:pPr>
       <w:r>
-        <w:t>6b. The per-shot prompts (one per image, numbered to the shot list)</w:t>
+        <w:t>6b. The per-element prompts (grouped by frame, numbered to the shot list)</w:t>
       </w:r>
     </w:p>
     <w:p>
@@ -1739,7 +1839,7 @@
         <w:rPr>
           <w:sz w:val="21"/>
         </w:rPr>
-        <w:t>Each = Consistency Header content + [shot type] + [subject &amp; action] + [setting] + [coral accent].</w:t>
+        <w:t>Group prompts under each Frame # and list the DRAW ORDER (the order the hand reveals them on the canvas).</w:t>
       </w:r>
     </w:p>
     <w:p>
@@ -1750,7 +1850,7 @@
         <w:rPr>
           <w:sz w:val="21"/>
         </w:rPr>
-        <w:t>RE-STATE recurring characters using the SAME wording as the Character Bible — never 'same as before' (that causes drift).</w:t>
+        <w:t>Each = Consistency Header content + [the ONE isolated element] + 'single isolated element, centered, transparent background, no scene, no ground shadow' + the COMPACT style tag.</w:t>
       </w:r>
     </w:p>
     <w:p>
@@ -1761,7 +1861,7 @@
         <w:rPr>
           <w:sz w:val="21"/>
         </w:rPr>
-        <w:t>Name the ONE thing that changes from the previous shot, so consecutive frames interconnect.</w:t>
+        <w:t>ONE element per prompt — a character, a prop, or a motif. RE-STATE recurring characters using the SAME wording as the Character Bible — never 'same as before' (that causes drift).</w:t>
       </w:r>
     </w:p>
     <w:p>
@@ -1772,7 +1872,7 @@
         <w:rPr>
           <w:sz w:val="21"/>
         </w:rPr>
-        <w:t>State the seed + shot-family; be self-contained and paste-ready.</w:t>
+        <w:t>Reuse a saved ELEMENT instead of re-prompting the Host/recurring props where possible; state the seed.</w:t>
       </w:r>
     </w:p>
     <w:p>
@@ -1783,7 +1883,7 @@
         <w:rPr>
           <w:sz w:val="21"/>
         </w:rPr>
-        <w:t>STAY UNDER 3000 CHARACTERS (Higgsfield's per-prompt limit). Use the COMPACT style tag, not the full paragraph — each self-contained prompt should land ~600–1000 characters.</w:t>
+        <w:t>STAY UNDER 3000 CHARACTERS (Higgsfield's per-prompt limit). Use the COMPACT style tag, not the full paragraph — each self-contained prompt should land ~500–900 characters.</w:t>
       </w:r>
     </w:p>
     <w:tbl>
@@ -1809,7 +1909,7 @@
                 <w:color w:val="8A4B16"/>
                 <w:sz w:val="20"/>
               </w:rPr>
-              <w:t>THOROUGHNESS RULE: every per-shot prompt carries a COMPLETE description of characters, palette, and style. Repeating it across all 150–300 prompts is exactly what keeps the separate images consistent.</w:t>
+              <w:t>THOROUGHNESS RULE: every per-element prompt carries a COMPLETE description of the element, palette, and style, and asks for a single isolated element on a transparent background — that is what keeps every separately-generated asset on-model and clean to layer in VideoScribe.</w:t>
             </w:r>
           </w:p>
         </w:tc>
@@ -1823,7 +1923,7 @@
           <w:color w:val="1F4E5F"/>
           <w:sz w:val="19"/>
         </w:rPr>
-        <w:t>COMPACT STYLE TAG (append to every per-shot prompt):</w:t>
+        <w:t>COMPACT STYLE TAG (append to every per-element prompt):</w:t>
       </w:r>
     </w:p>
     <w:tbl>
@@ -1848,7 +1948,7 @@
                 <w:rFonts w:ascii="Consolas" w:hAnsi="Consolas"/>
                 <w:sz w:val="18"/>
               </w:rPr>
-              <w:t>STYLE: flat 2D vector explainer-animation (Hey Duggee vibe); bold rounded geometric shapes, no outlines, flat color blocks; warm palette ochre #E8A93C, cream #F7EAD0, teal #3C7C9A, navy #21465A, coral #EF5A2A, burnt orange #CC6B2C, olive #A7A24A; flat soft lighting, minimal flat shadows, subtle film-grain; dot eyes, simple faces; cozy, clean, generous negative space; 16:9. No gradients/3D/realistic shading/gloss/black outlines/clutter/photorealism.</w:t>
+              <w:t>STYLE: bright cheerful flat 2D vector children's-book clip-art; rounded cute friendly shapes, soft subtle shading + gentle highlights, thin minimal edge accents (no heavy black outlines); dot eyes, rosy cheeks; palette sunshine #FBC02D, sky #4FC3E8, leaf #7CC576, coral #F0654E, tangerine #F39237, blush #F6A9B6, stone #9DB0BC, brown #8D6E63, cream #FBF7EF, charcoal #3A3631; SINGLE isolated element, centered, TRANSPARENT background, no scene/no ground shadow; clean modern wholesome. No grain/gradient/3D/realistic/photoreal/heavy outline/clutter/scene-background.</w:t>
             </w:r>
           </w:p>
         </w:tc>
@@ -1862,7 +1962,7 @@
           <w:color w:val="1F4E5F"/>
           <w:sz w:val="19"/>
         </w:rPr>
-        <w:t>EXAMPLE PER-SHOT PROMPT (~700 chars):</w:t>
+        <w:t>EXAMPLE PER-ELEMENT PROMPT (~600 chars):</w:t>
       </w:r>
     </w:p>
     <w:tbl>
@@ -1887,7 +1987,7 @@
                 <w:rFonts w:ascii="Consolas" w:hAnsi="Consolas"/>
                 <w:sz w:val="18"/>
               </w:rPr>
-              <w:t>Centered hero shot of rounded vampire bat (deep-navy body, teal wing membranes, tiny charcoal dot eyes, small fangs) hanging upside down in a warm softly-lit hollow, friendly, looking at camera. The bat is the focal subject. STYLE: flat 2D vector explainer-animation (Hey Duggee vibe); bold rounded geometric shapes, no outlines, flat color blocks; warm palette ochre #E8A93C, cream #F7EAD0, teal #3C7C9A, navy #21465A, coral #EF5A2A, burnt orange #CC6B2C, olive #A7A24A; flat soft lighting, minimal flat shadows, subtle film-grain; dot eyes, simple faces; cozy, clean, generous negative space; 16:9. No gradients/3D/realistic shading/gloss/black outlines/clutter/photorealism.</w:t>
+              <w:t>Single isolated clip-art vampire bat — rounded chunky body in stone gray with sky-blue wing membranes, tiny charcoal dot eyes, small white fangs, rosy cheeks, friendly, hanging upside down, centered. Single isolated element, transparent background, no scene, no ground shadow. STYLE: bright cheerful flat 2D vector children's-book clip-art; rounded cute friendly shapes, soft subtle shading + gentle highlights, thin minimal edge accents (no heavy black outlines); dot eyes, rosy cheeks; palette sunshine #FBC02D, sky #4FC3E8, leaf #7CC576, coral #F0654E, tangerine #F39237, blush #F6A9B6, stone #9DB0BC, brown #8D6E63, cream #FBF7EF, charcoal #3A3631; SINGLE isolated element, centered, TRANSPARENT background, no scene/no ground shadow; clean modern wholesome. No grain/gradient/3D/realistic/photoreal/heavy outline/clutter/scene-background.</w:t>
             </w:r>
           </w:p>
         </w:tc>
@@ -1899,45 +1999,223 @@
         <w:pStyle w:val="Heading1"/>
       </w:pPr>
       <w:r>
-        <w:t>7. Higgsfield Operations (models, consistency, credits)</w:t>
+        <w:t>7. Higgsfield Execution — Generating Transparent Element PNGs</w:t>
       </w:r>
     </w:p>
     <w:p>
-      <w:pPr>
-        <w:pStyle w:val="Heading2"/>
-      </w:pPr>
       <w:r>
-        <w:t>7a. Models</w:t>
+        <w:rPr>
+          <w:i w:val="0"/>
+          <w:sz w:val="21"/>
+        </w:rPr>
+        <w:t>This is the exact loop for turning each element prompt (Section 6) into a clean, transparent PNG ready to drop onto the VideoScribe canvas. Do this for EVERY element of EVERY frame (reusing saved Elements where you can).</w:t>
       </w:r>
     </w:p>
     <w:p>
       <w:pPr>
-        <w:pStyle w:val="ListBullet"/>
+        <w:pStyle w:val="Heading2"/>
+      </w:pPr>
+      <w:r>
+        <w:t>7a. Generate the isolated element</w:t>
+      </w:r>
+    </w:p>
+    <w:p>
+      <w:pPr>
+        <w:pStyle w:val="ListNumber"/>
       </w:pPr>
       <w:r>
         <w:rPr>
           <w:sz w:val="21"/>
         </w:rPr>
-        <w:t>PRIMARY: Seedream 4.5 (id seedream_v4_5) — high quality, up to 4K, ~1 credit/image, in the paid plans' 365-day unlimited set. Default for ALL images. quality 'high' for hero frames, 'basic' otherwise. 16:9.</w:t>
+        <w:t>Pick the model: Seedream 4.5 (seedream_v4_5) for the bulk — UNLIMITED/free in the web app on a paid plan. Use Nano Banana Pro only for elements that contain text/numbers (it renders text better).</w:t>
       </w:r>
     </w:p>
     <w:p>
       <w:pPr>
-        <w:pStyle w:val="ListBullet"/>
+        <w:pStyle w:val="ListNumber"/>
       </w:pPr>
       <w:r>
         <w:rPr>
           <w:sz w:val="21"/>
         </w:rPr>
-        <w:t>SECONDARY: Nano Banana Pro or GPT Image — ONLY for frames with on-image text/diagrams (better text). Cost more; use sparingly. (Better still: add text in the editor.)</w:t>
+        <w:t>Paste the element prompt: ONE isolated subject, centered, described as 'single isolated element on a plain background' + the COMPACT style tag. Attach the STYLE KEY-FRAME as a reference and the HOST/prop ELEMENT when the element is a recurring character or prop.</w:t>
       </w:r>
     </w:p>
     <w:p>
       <w:pPr>
+        <w:pStyle w:val="ListNumber"/>
+      </w:pPr>
+      <w:r>
+        <w:rPr>
+          <w:sz w:val="21"/>
+        </w:rPr>
+        <w:t>Generate 2–4 variations and keep the cleanest, most on-model one. Keep one SEED per character/prop so the same asset looks identical across frames.</w:t>
+      </w:r>
+    </w:p>
+    <w:p>
+      <w:pPr>
         <w:pStyle w:val="Heading2"/>
       </w:pPr>
       <w:r>
-        <w:t>7b. Web app vs API (this decides whether generation is FREE)</w:t>
+        <w:t>7b. Cut it out to a transparent PNG</w:t>
+      </w:r>
+    </w:p>
+    <w:p>
+      <w:pPr>
+        <w:pStyle w:val="ListBullet"/>
+      </w:pPr>
+      <w:r>
+        <w:rPr>
+          <w:sz w:val="21"/>
+        </w:rPr>
+        <w:t>Seedream/Nano Banana FILL the background — so the cutout step is what gives you the alpha. Generate on a plain, flat, high-contrast background (e.g. plain cream or plain blue) to make removal clean.</w:t>
+      </w:r>
+    </w:p>
+    <w:p>
+      <w:pPr>
+        <w:pStyle w:val="ListBullet"/>
+      </w:pPr>
+      <w:r>
+        <w:rPr>
+          <w:sz w:val="21"/>
+        </w:rPr>
+        <w:t>Run BACKGROUND REMOVAL on the chosen image: in the web app use the remove-background tool, or via MCP call remove_background with the generation's media_id and media_type='image'. Result = a transparent cutout.</w:t>
+      </w:r>
+    </w:p>
+    <w:p>
+      <w:pPr>
+        <w:pStyle w:val="ListBullet"/>
+      </w:pPr>
+      <w:r>
+        <w:rPr>
+          <w:sz w:val="21"/>
+        </w:rPr>
+        <w:t>Download the cutout and save it as frames/frame_0NN/frame_0NN_elXX_&lt;name&gt;.png (PNG with alpha).</w:t>
+      </w:r>
+    </w:p>
+    <w:tbl>
+      <w:tblPr>
+        <w:tblStyle w:val="TableGrid"/>
+        <w:tblW w:type="auto" w:w="0"/>
+        <w:tblLook w:firstColumn="1" w:firstRow="1" w:lastColumn="0" w:lastRow="0" w:noHBand="0" w:noVBand="1" w:val="04A0"/>
+      </w:tblPr>
+      <w:tblGrid>
+        <w:gridCol w:w="8640"/>
+      </w:tblGrid>
+      <w:tr>
+        <w:tc>
+          <w:tcPr>
+            <w:tcW w:type="dxa" w:w="8640"/>
+            <w:shd w:val="clear" w:color="auto" w:fill="FBEFD6"/>
+          </w:tcPr>
+          <w:p>
+            <w:r/>
+            <w:r>
+              <w:rPr>
+                <w:b/>
+                <w:color w:val="8A4B16"/>
+                <w:sz w:val="20"/>
+              </w:rPr>
+              <w:t>WHY TRANSPARENT: isolated alpha PNGs layer cleanly on the VideoScribe canvas with no white halos, so the hand can draw each element on independently and they overlap naturally to build the frame.</w:t>
+            </w:r>
+          </w:p>
+        </w:tc>
+      </w:tr>
+    </w:tbl>
+    <w:p/>
+    <w:p>
+      <w:pPr>
+        <w:pStyle w:val="Heading2"/>
+      </w:pPr>
+      <w:r>
+        <w:t>7c. Optional — SVG line version (true pen strokes)</w:t>
+      </w:r>
+    </w:p>
+    <w:p>
+      <w:pPr>
+        <w:pStyle w:val="ListBullet"/>
+      </w:pPr>
+      <w:r>
+        <w:rPr>
+          <w:sz w:val="21"/>
+        </w:rPr>
+        <w:t>Flat PNGs REVEAL under the moving hand (a wipe-on). For genuine pen-stroke drawing, also make an SVG line version of the element (auto-trace the PNG in Illustrator Image Trace / Inkscape) and let the flat color fill behind it in VideoScribe. Use for hero elements where the drawing motion should really read.</w:t>
+      </w:r>
+    </w:p>
+    <w:tbl>
+      <w:tblPr>
+        <w:tblStyle w:val="TableGrid"/>
+        <w:tblW w:type="auto" w:w="0"/>
+        <w:tblLook w:firstColumn="1" w:firstRow="1" w:lastColumn="0" w:lastRow="0" w:noHBand="0" w:noVBand="1" w:val="04A0"/>
+      </w:tblPr>
+      <w:tblGrid>
+        <w:gridCol w:w="8640"/>
+      </w:tblGrid>
+      <w:tr>
+        <w:tc>
+          <w:tcPr>
+            <w:tcW w:type="dxa" w:w="8640"/>
+            <w:shd w:val="clear" w:color="auto" w:fill="FBEFD6"/>
+          </w:tcPr>
+          <w:p>
+            <w:r/>
+            <w:r>
+              <w:rPr>
+                <w:b/>
+                <w:color w:val="8A4B16"/>
+                <w:sz w:val="20"/>
+              </w:rPr>
+              <w:t>Section 8 covers models/credits/clips; the VideoScribe Assembly section covers putting these PNGs together.</w:t>
+            </w:r>
+          </w:p>
+        </w:tc>
+      </w:tr>
+    </w:tbl>
+    <w:p/>
+    <w:p>
+      <w:pPr>
+        <w:pStyle w:val="Heading1"/>
+      </w:pPr>
+      <w:r>
+        <w:t>8. Higgsfield Operations (models, consistency, credits)</w:t>
+      </w:r>
+    </w:p>
+    <w:p>
+      <w:pPr>
+        <w:pStyle w:val="Heading2"/>
+      </w:pPr>
+      <w:r>
+        <w:t>8a. Models</w:t>
+      </w:r>
+    </w:p>
+    <w:p>
+      <w:pPr>
+        <w:pStyle w:val="ListBullet"/>
+      </w:pPr>
+      <w:r>
+        <w:rPr>
+          <w:sz w:val="21"/>
+        </w:rPr>
+        <w:t>PRIMARY: Seedream 4.5 (id seedream_v4_5) — high quality, up to 4K, ~1 credit/image, in the paid plans' 365-day unlimited set. Default for ALL elements. quality 'high' for hero elements, 'basic' otherwise.</w:t>
+      </w:r>
+    </w:p>
+    <w:p>
+      <w:pPr>
+        <w:pStyle w:val="ListBullet"/>
+      </w:pPr>
+      <w:r>
+        <w:rPr>
+          <w:sz w:val="21"/>
+        </w:rPr>
+        <w:t>SECONDARY: Nano Banana Pro or GPT Image — ONLY for elements with on-image text/diagrams (better text). Cost more; use sparingly. (Better still: add text in VideoScribe / the editor.)</w:t>
+      </w:r>
+    </w:p>
+    <w:p>
+      <w:pPr>
+        <w:pStyle w:val="Heading2"/>
+      </w:pPr>
+      <w:r>
+        <w:t>8b. Web app vs API (this decides whether generation is FREE)</w:t>
       </w:r>
     </w:p>
     <w:p>
@@ -1978,7 +2256,7 @@
         <w:pStyle w:val="Heading2"/>
       </w:pPr>
       <w:r>
-        <w:t>7c. Consistency tools (so frames flow like one animation)</w:t>
+        <w:t>8c. Consistency tools (so every element stays on-model)</w:t>
       </w:r>
     </w:p>
     <w:p>
@@ -1989,7 +2267,7 @@
         <w:rPr>
           <w:sz w:val="21"/>
         </w:rPr>
-        <w:t>Save the HOST + recurring sets/props as ELEMENTS (for Seedream use Elements + reference images — NOT Soul).</w:t>
+        <w:t>Save the HOST + recurring props as ELEMENTS (for Seedream use Elements + reference images — NOT Soul) and REUSE them across frames instead of regenerating.</w:t>
       </w:r>
     </w:p>
     <w:p>
@@ -2011,7 +2289,7 @@
         <w:rPr>
           <w:sz w:val="21"/>
         </w:rPr>
-        <w:t>Reuse ONE SEED within a shot-family; change only ONE element per frame (shot families).</w:t>
+        <w:t>Reuse ONE SEED per character/prop so the same asset is identical in every frame it appears.</w:t>
       </w:r>
     </w:p>
     <w:p>
@@ -2022,7 +2300,7 @@
         <w:rPr>
           <w:sz w:val="21"/>
         </w:rPr>
-        <w:t>Generate 2–4 variations per shot and keep the best — AI drifts slightly even with anchors.</w:t>
+        <w:t>Generate 2–4 variations per element and keep the best — AI drifts slightly even with anchors.</w:t>
       </w:r>
     </w:p>
     <w:p>
@@ -2030,7 +2308,7 @@
         <w:pStyle w:val="Heading2"/>
       </w:pPr>
       <w:r>
-        <w:t>7d. Clips</w:t>
+        <w:t>8d. Clips (optional motion)</w:t>
       </w:r>
     </w:p>
     <w:p>
@@ -2041,7 +2319,7 @@
         <w:rPr>
           <w:sz w:val="21"/>
         </w:rPr>
-        <w:t>Default to stills. Use a short (2–4s) clip ONLY where motion is essential (typing, a number ticking, a chart drawing, a coin flip). Generate the still first, then animate it.</w:t>
+        <w:t>Default motion is the VideoScribe hand-reveal. Use a short (2–4s) image-to-video CLIP only where real motion is essential (a coin flip, a number ticking, a chart drawing). Generate the element still first, then animate it; drop the clip onto the VideoScribe/editor timeline at that frame.</w:t>
       </w:r>
     </w:p>
     <w:p>
@@ -2049,7 +2327,7 @@
         <w:pStyle w:val="Heading2"/>
       </w:pPr>
       <w:r>
-        <w:t>7e. Plans &amp; credits</w:t>
+        <w:t>8e. Plans &amp; credits</w:t>
       </w:r>
     </w:p>
     <w:p>
@@ -2101,7 +2379,177 @@
         <w:pStyle w:val="Heading1"/>
       </w:pPr>
       <w:r>
-        <w:t>8. Step-by-Step Procedure When a Row Is Called</w:t>
+        <w:t>9. VideoScribe Assembly (Draw-On Reveal)</w:t>
+      </w:r>
+    </w:p>
+    <w:p>
+      <w:r>
+        <w:rPr>
+          <w:i w:val="0"/>
+          <w:sz w:val="21"/>
+        </w:rPr>
+        <w:t>This is where the episode is built: the animated hand draws each element PNG onto the canvas, frame by frame, to produce the video. Recommended tool: VideoScribe (Sparkol); the desktop app handles imported PNGs best.</w:t>
+      </w:r>
+    </w:p>
+    <w:p>
+      <w:pPr>
+        <w:pStyle w:val="Heading2"/>
+      </w:pPr>
+      <w:r>
+        <w:t>9a. Project setup (once per episode)</w:t>
+      </w:r>
+    </w:p>
+    <w:p>
+      <w:pPr>
+        <w:pStyle w:val="ListNumber"/>
+      </w:pPr>
+      <w:r>
+        <w:rPr>
+          <w:sz w:val="21"/>
+        </w:rPr>
+        <w:t>New scribe → set the canvas to 16:9 and the background to CREAM (#FBF7EF) — the brand canvas.</w:t>
+      </w:r>
+    </w:p>
+    <w:p>
+      <w:pPr>
+        <w:pStyle w:val="ListNumber"/>
+      </w:pPr>
+      <w:r>
+        <w:rPr>
+          <w:sz w:val="21"/>
+        </w:rPr>
+        <w:t>Decide voiceover first (import VO audio) so element draw-times can be matched to the narration.</w:t>
+      </w:r>
+    </w:p>
+    <w:p>
+      <w:pPr>
+        <w:pStyle w:val="Heading2"/>
+      </w:pPr>
+      <w:r>
+        <w:t>9b. Build each frame (in narration order)</w:t>
+      </w:r>
+    </w:p>
+    <w:p>
+      <w:pPr>
+        <w:pStyle w:val="ListNumber"/>
+      </w:pPr>
+      <w:r>
+        <w:rPr>
+          <w:sz w:val="21"/>
+        </w:rPr>
+        <w:t>Import the frame's element PNGs (the image/camera icon → Add image) from frames/frame_0NN/.</w:t>
+      </w:r>
+    </w:p>
+    <w:p>
+      <w:pPr>
+        <w:pStyle w:val="ListNumber"/>
+      </w:pPr>
+      <w:r>
+        <w:rPr>
+          <w:sz w:val="21"/>
+        </w:rPr>
+        <w:t>Position and scale each element to its place in the 16:9 layout; keep the bottom ~15% caption-safe.</w:t>
+      </w:r>
+    </w:p>
+    <w:p>
+      <w:pPr>
+        <w:pStyle w:val="ListNumber"/>
+      </w:pPr>
+      <w:r>
+        <w:rPr>
+          <w:sz w:val="21"/>
+        </w:rPr>
+        <w:t>Per element, open its properties and set DRAW TIME (e.g. 1–3s), PAUSE, and TRANSITION so the elements reveal in the planned DRAW ORDER across the frame's narration slice (frame total ≈ 3–5s).</w:t>
+      </w:r>
+    </w:p>
+    <w:p>
+      <w:pPr>
+        <w:pStyle w:val="ListNumber"/>
+      </w:pPr>
+      <w:r>
+        <w:rPr>
+          <w:sz w:val="21"/>
+        </w:rPr>
+        <w:t>Choose a drawing HAND (or 'no hand' for a clean wipe-on). Use the same hand throughout for consistency.</w:t>
+      </w:r>
+    </w:p>
+    <w:p>
+      <w:pPr>
+        <w:pStyle w:val="ListNumber"/>
+      </w:pPr>
+      <w:r>
+        <w:rPr>
+          <w:sz w:val="21"/>
+        </w:rPr>
+        <w:t>On the timeline, order all elements of the frame, then move to the next frame; repeat. The sequence of frames IS the video.</w:t>
+      </w:r>
+    </w:p>
+    <w:p>
+      <w:pPr>
+        <w:pStyle w:val="Heading2"/>
+      </w:pPr>
+      <w:r>
+        <w:t>9c. Finish &amp; export</w:t>
+      </w:r>
+    </w:p>
+    <w:p>
+      <w:pPr>
+        <w:pStyle w:val="ListBullet"/>
+      </w:pPr>
+      <w:r>
+        <w:rPr>
+          <w:sz w:val="21"/>
+        </w:rPr>
+        <w:t>Add captions/on-screen text and music. For any CLIP shots (Section 8d), drop the MP4 onto the timeline at that frame instead of drawing a still.</w:t>
+      </w:r>
+    </w:p>
+    <w:p>
+      <w:pPr>
+        <w:pStyle w:val="ListBullet"/>
+      </w:pPr>
+      <w:r>
+        <w:rPr>
+          <w:sz w:val="21"/>
+        </w:rPr>
+        <w:t>Render/Download → MP4 at 1080p (or higher). That render is the finished episode.</w:t>
+      </w:r>
+    </w:p>
+    <w:tbl>
+      <w:tblPr>
+        <w:tblStyle w:val="TableGrid"/>
+        <w:tblW w:type="auto" w:w="0"/>
+        <w:tblLook w:firstColumn="1" w:firstRow="1" w:lastColumn="0" w:lastRow="0" w:noHBand="0" w:noVBand="1" w:val="04A0"/>
+      </w:tblPr>
+      <w:tblGrid>
+        <w:gridCol w:w="8640"/>
+      </w:tblGrid>
+      <w:tr>
+        <w:tc>
+          <w:tcPr>
+            <w:tcW w:type="dxa" w:w="8640"/>
+            <w:shd w:val="clear" w:color="auto" w:fill="FBEFD6"/>
+          </w:tcPr>
+          <w:p>
+            <w:r/>
+            <w:r>
+              <w:rPr>
+                <w:b/>
+                <w:color w:val="8A4B16"/>
+                <w:sz w:val="20"/>
+              </w:rPr>
+              <w:t>PNG vs SVG: flat element PNGs reveal UNDER the hand (a wipe-on); SVG line versions (Section 7c) draw as true pen strokes. Mix as needed — SVG for hero draws, PNG for everything else.</w:t>
+            </w:r>
+          </w:p>
+        </w:tc>
+      </w:tr>
+    </w:tbl>
+    <w:p/>
+    <w:p>
+      <w:pPr>
+        <w:pStyle w:val="Heading1"/>
+      </w:pPr>
+      <w:r>
+        <w:t>10. Step-by-Step Procedure When a Row Is Called</w:t>
       </w:r>
     </w:p>
     <w:p>
@@ -2145,7 +2593,7 @@
         <w:rPr>
           <w:sz w:val="21"/>
         </w:rPr>
-        <w:t>Compute duration (words ÷ 2.5) and segment into 3–5s shots; assign timestamps (5a).</w:t>
+        <w:t>Compute duration (words ÷ 2.5) and segment into 3–5s FRAMES; assign timestamps (5a).</w:t>
       </w:r>
     </w:p>
     <w:p>
@@ -2156,7 +2604,7 @@
         <w:rPr>
           <w:sz w:val="21"/>
         </w:rPr>
-        <w:t>Build the SHOT LIST (Deliverable A): narration slice, one-line visual, file name, type per shot.</w:t>
+        <w:t>Build the SHOT LIST (Deliverable A): per frame — narration slice, one-line visual, ELEMENT breakdown, draw order, file names, type.</w:t>
       </w:r>
     </w:p>
     <w:p>
@@ -2167,7 +2615,7 @@
         <w:rPr>
           <w:sz w:val="21"/>
         </w:rPr>
-        <w:t>Group shots into shot families so consecutive images flow.</w:t>
+        <w:t>Build the PROMPT PACK (Deliverable B, Section 6): consistency header + per-element prompts grouped by frame, restating characters verbatim, each asking for a single isolated element on a transparent background.</w:t>
       </w:r>
     </w:p>
     <w:p>
@@ -2178,7 +2626,7 @@
         <w:rPr>
           <w:sz w:val="21"/>
         </w:rPr>
-        <w:t>Build the PROMPT PACK (Deliverable B, Section 6): consistency header + one paste-ready, under-3000-char prompt per shot, restating characters verbatim.</w:t>
+        <w:t>Generate the ELEMENTS (Section 7): run each prompt on Seedream 4.5 (free in the web app), reuse Host/prop Elements + style key-frame, then remove background → save transparent PNGs into frames/frame_0NN/.</w:t>
       </w:r>
     </w:p>
     <w:p>
@@ -2189,7 +2637,7 @@
         <w:rPr>
           <w:sz w:val="21"/>
         </w:rPr>
-        <w:t>Produce the IMAGES (Deliverable C) by running the pack — free in the web app on Seedream 4.5 (recommended), or via API at credit cost — 16:9, reusing the Host Element + style key-frame; Nano Banana Pro only for text frames.</w:t>
+        <w:t>For any CLIP shots, generate the element still then animate it (Section 8d).</w:t>
       </w:r>
     </w:p>
     <w:p>
@@ -2200,7 +2648,7 @@
         <w:rPr>
           <w:sz w:val="21"/>
         </w:rPr>
-        <w:t>For CLIP shots, generate the still then animate it.</w:t>
+        <w:t>Assemble in VideoScribe (Section 9): draw each element on, frame by frame; add VO/captions/music; render MP4.</w:t>
       </w:r>
     </w:p>
     <w:p>
@@ -2211,7 +2659,7 @@
         <w:rPr>
           <w:sz w:val="21"/>
         </w:rPr>
-        <w:t>Save all three deliverables per Section 5b naming, then run the checklists (Section 9).</w:t>
+        <w:t>Save all deliverables per Section 5b naming, then run the checklists (Section 11).</w:t>
       </w:r>
     </w:p>
     <w:p>
@@ -2219,7 +2667,7 @@
         <w:pStyle w:val="Heading1"/>
       </w:pPr>
       <w:r>
-        <w:t>9. Quality Checklists</w:t>
+        <w:t>11. Quality Checklists</w:t>
       </w:r>
     </w:p>
     <w:p>
@@ -2267,7 +2715,7 @@
         <w:pStyle w:val="ListBullet"/>
       </w:pPr>
       <w:r>
-        <w:t>☐  Every shot 3–5s; one image per shot; timestamps sum to total duration.</w:t>
+        <w:t>☐  Every frame 3–5s; each frame lists its elements + draw order; timestamps sum to total duration.</w:t>
       </w:r>
     </w:p>
     <w:p>
@@ -2275,7 +2723,7 @@
         <w:pStyle w:val="ListBullet"/>
       </w:pPr>
       <w:r>
-        <w:t>☐  Numbers match across shot list, prompt pack, and image files.</w:t>
+        <w:t>☐  Numbers match across shot list, prompt pack, and frame/element files.</w:t>
       </w:r>
     </w:p>
     <w:p>
@@ -2291,7 +2739,7 @@
         <w:pStyle w:val="ListBullet"/>
       </w:pPr>
       <w:r>
-        <w:t>☐  Consistency header present (compact style tag + character/world bible + palette + settings).</w:t>
+        <w:t>☐  Consistency header present (compact style tag + character/prop bible + palette + settings).</w:t>
       </w:r>
     </w:p>
     <w:p>
@@ -2299,7 +2747,7 @@
         <w:pStyle w:val="ListBullet"/>
       </w:pPr>
       <w:r>
-        <w:t>☐  Every per-shot prompt restates characters VERBATIM and is under 3000 characters.</w:t>
+        <w:t>☐  Every per-element prompt restates characters VERBATIM, asks for a single isolated element on a transparent background, and is under 3000 characters.</w:t>
       </w:r>
     </w:p>
     <w:p>
@@ -2307,7 +2755,7 @@
         <w:pStyle w:val="ListBullet"/>
       </w:pPr>
       <w:r>
-        <w:t>☐  Self-contained, paste-ready, numbered to match; seed/shot-family noted.</w:t>
+        <w:t>☐  Grouped by frame with draw order; numbered to match; seed noted.</w:t>
       </w:r>
     </w:p>
     <w:p>
@@ -2315,7 +2763,7 @@
         <w:pStyle w:val="Heading2"/>
       </w:pPr>
       <w:r>
-        <w:t>Images (each)</w:t>
+        <w:t>Element PNGs (each)</w:t>
       </w:r>
     </w:p>
     <w:p>
@@ -2323,7 +2771,7 @@
         <w:pStyle w:val="ListBullet"/>
       </w:pPr>
       <w:r>
-        <w:t>☐  Flat colors only; palette only; coral on the one focal element.</w:t>
+        <w:t>☐  Brand palette only; tomato coral reserved for the one focal element of the frame.</w:t>
       </w:r>
     </w:p>
     <w:p>
@@ -2331,7 +2779,7 @@
         <w:pStyle w:val="ListBullet"/>
       </w:pPr>
       <w:r>
-        <w:t>☐  No black outlines/gradients/3D; subtle grain + soft flat shadows.</w:t>
+        <w:t>☐  Bright clip-art look: soft shading + gentle highlights, thin edge accents; no heavy black outlines, no grain, no gradients, no 3D.</w:t>
       </w:r>
     </w:p>
     <w:p>
@@ -2339,7 +2787,7 @@
         <w:pStyle w:val="ListBullet"/>
       </w:pPr>
       <w:r>
-        <w:t>☐  Recurring characters identical to their canonical reference.</w:t>
+        <w:t>☐  Single isolated element, TRANSPARENT background, clean cutout (no halo), no ground shadow.</w:t>
       </w:r>
     </w:p>
     <w:p>
@@ -2347,7 +2795,31 @@
         <w:pStyle w:val="ListBullet"/>
       </w:pPr>
       <w:r>
-        <w:t>☐  16:9; clear subject; bottom 15% caption-safe; consecutive frames interconnect.</w:t>
+        <w:t>☐  Recurring characters identical to their canonical Element; named frame_0NN_elXX_&lt;name&gt;.png.</w:t>
+      </w:r>
+    </w:p>
+    <w:p>
+      <w:pPr>
+        <w:pStyle w:val="Heading2"/>
+      </w:pPr>
+      <w:r>
+        <w:t>Assembly</w:t>
+      </w:r>
+    </w:p>
+    <w:p>
+      <w:pPr>
+        <w:pStyle w:val="ListBullet"/>
+      </w:pPr>
+      <w:r>
+        <w:t>☐  16:9 cream canvas; clear focal subject per frame; bottom 15% caption-safe.</w:t>
+      </w:r>
+    </w:p>
+    <w:p>
+      <w:pPr>
+        <w:pStyle w:val="ListBullet"/>
+      </w:pPr>
+      <w:r>
+        <w:t>☐  Elements drawn on in the planned order; timing matches the VO; frames flow in sequence.</w:t>
       </w:r>
     </w:p>
     <w:p>
@@ -2365,7 +2837,7 @@
           <w:color w:val="1F4E5F"/>
           <w:sz w:val="19"/>
         </w:rPr>
-        <w:t>FULL MASTER STYLE SUFFIX (for single hero images where length is not a constraint):</w:t>
+        <w:t>FULL MASTER STYLE SUFFIX (for single hero elements where length is not a constraint):</w:t>
       </w:r>
     </w:p>
     <w:tbl>
@@ -2390,7 +2862,7 @@
                 <w:rFonts w:ascii="Consolas" w:hAnsi="Consolas"/>
                 <w:sz w:val="18"/>
               </w:rPr>
-              <w:t>Flat 2D vector illustration in a warm mid-century-modern explainer-animation style (in the spirit of Hey Duggee / modern motion-graphics). Bold simple geometric shapes with soft rounded corners. No outlines, forms defined by flat color blocks. Limited warm palette: ochre yellow (#E8A93C), warm cream (#F7EAD0), teal blue (#3C7C9A), deep navy (#21465A), coral red-orange (#EF5A2A), burnt orange (#CC6B2C), moss olive (#A7A24A). Flat soft ambient lighting, gentle minimal flat shadows. Subtle fine film-grain / paper texture over the whole frame. Simple dot eyes, minimal facial features. Cozy, friendly, clean, generous negative space. 16:9. No gradients, no 3D, no realistic shading, no glossy highlights, no heavy black outlines, no clutter, no photorealism.</w:t>
+              <w:t>Bright, cheerful, wholesome flat 2D vector children's-book clip-art illustration. Rounded, cute, friendly characters and objects with clean simple shapes and chunky proportions. Soft subtle shading and gentle soft highlights for a little depth; thin minimal darker edge accents only where a shape needs separation (no heavy black outlines). Small dot eyes, rosy cheek blush, simple happy expressions. Bright multicolor brand palette: sunshine yellow (#FBC02D), sky blue (#4FC3E8), leaf green (#7CC576), tomato coral (#F0654E), tangerine (#F39237), blush pink (#F6A9B6), stone gray (#9DB0BC), warm brown (#8D6E63), cream (#FBF7EF), charcoal (#3A3631). SINGLE isolated element only, centered, on a plain TRANSPARENT background — no scene, no setting, no ground shadow. Clean, modern, wholesome. No grain, no gradients, no 3D, no realistic textures, no photorealism, no heavy black outlines, no clutter, no scene background.</w:t>
             </w:r>
           </w:p>
         </w:tc>
@@ -2404,7 +2876,7 @@
           <w:color w:val="1F4E5F"/>
           <w:sz w:val="19"/>
         </w:rPr>
-        <w:t>COMPACT STYLE TAG (for per-shot prompts — keeps each under 3000 chars):</w:t>
+        <w:t>COMPACT STYLE TAG (for per-element prompts — keeps each under 3000 chars):</w:t>
       </w:r>
     </w:p>
     <w:tbl>
@@ -2429,7 +2901,7 @@
                 <w:rFonts w:ascii="Consolas" w:hAnsi="Consolas"/>
                 <w:sz w:val="18"/>
               </w:rPr>
-              <w:t>STYLE: flat 2D vector explainer-animation (Hey Duggee vibe); bold rounded geometric shapes, no outlines, flat color blocks; warm palette ochre #E8A93C, cream #F7EAD0, teal #3C7C9A, navy #21465A, coral #EF5A2A, burnt orange #CC6B2C, olive #A7A24A; flat soft lighting, minimal flat shadows, subtle film-grain; dot eyes, simple faces; cozy, clean, generous negative space; 16:9. No gradients/3D/realistic shading/gloss/black outlines/clutter/photorealism.</w:t>
+              <w:t>STYLE: bright cheerful flat 2D vector children's-book clip-art; rounded cute friendly shapes, soft subtle shading + gentle highlights, thin minimal edge accents (no heavy black outlines); dot eyes, rosy cheeks; palette sunshine #FBC02D, sky #4FC3E8, leaf #7CC576, coral #F0654E, tangerine #F39237, blush #F6A9B6, stone #9DB0BC, brown #8D6E63, cream #FBF7EF, charcoal #3A3631; SINGLE isolated element, centered, TRANSPARENT background, no scene/no ground shadow; clean modern wholesome. No grain/gradient/3D/realistic/photoreal/heavy outline/clutter/scene-background.</w:t>
             </w:r>
           </w:p>
         </w:tc>
@@ -2468,7 +2940,7 @@
                 <w:rFonts w:ascii="Consolas" w:hAnsi="Consolas"/>
                 <w:sz w:val="18"/>
               </w:rPr>
-              <w:t>photorealism, 3D render, CGI, realistic textures, gradients, glossy/metallic highlights, ambient occlusion, drop shadows, lens flare, glow/bloom, heavy black outlines, comic linework, sketchy wobble, crosshatching, neon colors, dark/gritty mood, cluttered backgrounds, complex detailed faces, tiny illegible text, watermarks, extra limbs/fingers, natural photographic animal coloring.</w:t>
+              <w:t>scene background, environment, ground shadow, multiple subjects, photorealism, 3D render, CGI, realistic textures, film grain, gradients banding, glossy/metallic highlights, ambient occlusion, drop shadows, lens flare, glow/bloom, heavy black outlines, comic linework, sketchy wobble, crosshatching, dark/gritty mood, cluttered detail, complex detailed faces, tiny illegible text, watermarks, extra limbs/fingers, natural photographic animal coloring.</w:t>
             </w:r>
           </w:p>
         </w:tc>
@@ -2482,7 +2954,7 @@
           <w:color w:val="888888"/>
           <w:sz w:val="19"/>
         </w:rPr>
-        <w:t>End of master guide. Input: one row of finance_animal_behavior_matches.xlsx. Output: a shot-list .docx, a Higgsfield prompt pack, and an image folder — fixed series style, visuals every 3–5 seconds.</w:t>
+        <w:t>End of master guide. Input: one row of finance_animal_behavior_matches.xlsx. Output: a shot-list .docx, a Higgsfield prompt pack, and a frames folder of transparent element PNGs — assembled in VideoScribe with the animated hand-reveal, fixed series style, visuals every 3–5 seconds.</w:t>
       </w:r>
     </w:p>
     <w:sectPr>

</xml_diff>

<commit_message>
Infuse the consolidated style+color consistency block into the master guide
Replace the master guide's scattered Visual Style section (4a core traits /
4b palette / 4c characters / 4d motifs+composition) with the single authoritative
'Visual Style & Color Consistency' section that mirrors STYLE_AND_COLOR_GUIDE:
the one rule, the style sentence, the style rules, the canonical palette table,
character anchors (verbatim), the focal-color rule, and the style tags inline.
Regenerate PROJECT_MASTER_GUIDE.docx.

https://claude.ai/code/session_012yrhJkQFRZkiQjmevywnos
</commit_message>
<xml_diff>
--- a/PROJECT_MASTER_GUIDE.docx
+++ b/PROJECT_MASTER_GUIDE.docx
@@ -640,7 +640,7 @@
         <w:pStyle w:val="Heading1"/>
       </w:pPr>
       <w:r>
-        <w:t>4. Visual Style — Applied to EVERY Episode</w:t>
+        <w:t>4. Visual Style &amp; Color Consistency — Applied to EVERY Episode</w:t>
       </w:r>
     </w:p>
     <w:tbl>
@@ -666,7 +666,7 @@
                 <w:color w:val="8A4B16"/>
                 <w:sz w:val="20"/>
               </w:rPr>
-              <w:t>Mandatory and unchanging. Every element in every episode matches this. Append the style tag (Section 6 / Appendix) to every Higgsfield prompt. Every element is generated ISOLATED on a transparent background.</w:t>
+              <w:t>THE ONE RULE: the SAME palette + the SAME style on every frame of every episode — that sameness IS the brand. Only the CONTENT changes between videos. Append a style tag (4e / Appendix) to every prompt; if a new image doesn't match this section, regenerate it. Every element is generated ISOLATED on a transparent background.</w:t>
             </w:r>
           </w:p>
         </w:tc>
@@ -674,12 +674,20 @@
     </w:tbl>
     <w:p/>
     <w:p>
+      <w:pPr>
+        <w:pStyle w:val="Heading2"/>
+      </w:pPr>
+      <w:r>
+        <w:t>4a. The style in one sentence</w:t>
+      </w:r>
+    </w:p>
+    <w:p>
       <w:r>
         <w:rPr>
           <w:i w:val="0"/>
           <w:sz w:val="21"/>
         </w:rPr>
-        <w:t>One sentence: bright, cheerful, wholesome FLAT 2D vector children's-book CLIP-ART — rounded cute friendly characters and objects, clean simple shapes, soft subtle shading with gentle highlights, thin minimal edge accents (no heavy black outlines), dot eyes and rosy cheeks; every asset a SINGLE isolated element on a transparent background.</w:t>
+        <w:t>Bright, cheerful, wholesome FLAT 2D vector children's-book CLIP-ART: rounded, cute, friendly characters and objects; clean simple shapes; soft subtle shading with gentle highlights; thin minimal edge accents (no heavy black outlines); small dot eyes and rosy cheeks. Every asset is a SINGLE isolated element on a transparent background, drawn onto the cream VideoScribe canvas.</w:t>
       </w:r>
     </w:p>
     <w:p>
@@ -687,7 +695,7 @@
         <w:pStyle w:val="Heading2"/>
       </w:pPr>
       <w:r>
-        <w:t>4a. Core traits</w:t>
+        <w:t>4b. Style rules (the non-negotiables)</w:t>
       </w:r>
     </w:p>
     <w:p>
@@ -698,7 +706,7 @@
         <w:rPr>
           <w:sz w:val="21"/>
         </w:rPr>
-        <w:t>CLIP-ART, ISOLATED — one element per asset, centered, on a TRANSPARENT background (no scene, no ground shadow).</w:t>
+        <w:t>CLIP-ART, ISOLATED — one element per asset, centered, on a TRANSPARENT background. No scenes, no settings, no ground shadow.</w:t>
       </w:r>
     </w:p>
     <w:p>
@@ -720,7 +728,7 @@
         <w:rPr>
           <w:sz w:val="21"/>
         </w:rPr>
-        <w:t>SOFT SHADING + HIGHLIGHTS — gentle subtle shading and soft highlights for a little depth (not flat-only, not 3D).</w:t>
+        <w:t>SOFT SHADING + HIGHLIGHTS — gentle subtle depth; never flat-dead, never 3D.</w:t>
       </w:r>
     </w:p>
     <w:p>
@@ -731,7 +739,7 @@
         <w:rPr>
           <w:sz w:val="21"/>
         </w:rPr>
-        <w:t>THIN MINIMAL EDGE ACCENTS — light darker edges only where shapes need separation; NO heavy black ink outlines.</w:t>
+        <w:t>THIN EDGE ACCENTS ONLY — light darker edges where shapes need separation; NO heavy black ink outlines.</w:t>
       </w:r>
     </w:p>
     <w:p>
@@ -742,7 +750,7 @@
         <w:rPr>
           <w:sz w:val="21"/>
         </w:rPr>
-        <w:t>BRIGHT MULTICOLOR BRAND PALETTE (below) — cheerful and saturated, but fixed for series consistency.</w:t>
+        <w:t>BRAND PALETTE ONLY (4c) — bright and cheerful, but fixed. Re-tint real animals into the palette.</w:t>
       </w:r>
     </w:p>
     <w:p>
@@ -764,15 +772,26 @@
         <w:rPr>
           <w:sz w:val="21"/>
         </w:rPr>
-        <w:t>CLEAN &amp; WHOLESOME — uncluttered, modern, no grain, no texture overlays.</w:t>
+        <w:t>CLEAN &amp; WHOLESOME — uncluttered, modern; NO grain, NO texture overlays, NO gradients.</w:t>
       </w:r>
     </w:p>
     <w:p>
       <w:pPr>
+        <w:pStyle w:val="ListBullet"/>
+      </w:pPr>
+      <w:r>
+        <w:rPr>
+          <w:sz w:val="21"/>
+        </w:rPr>
+        <w:t>ONE FOCAL COLOR — reserve TOMATO CORAL for the single thing the viewer should look at in each frame.</w:t>
+      </w:r>
+    </w:p>
+    <w:p>
+      <w:pPr>
         <w:pStyle w:val="Heading2"/>
       </w:pPr>
       <w:r>
-        <w:t>4b. Color palette (canonical brand hex)</w:t>
+        <w:t>4c. The color palette (canonical — use these exact hex values)</w:t>
       </w:r>
     </w:p>
     <w:tbl>
@@ -852,7 +871,7 @@
                 <w:color w:val="FFFFFF"/>
                 <w:sz w:val="17"/>
               </w:rPr>
-              <w:t>Usage</w:t>
+              <w:t>Where it's used</w:t>
             </w:r>
           </w:p>
         </w:tc>
@@ -976,7 +995,7 @@
                 <w:b w:val="0"/>
                 <w:sz w:val="17"/>
               </w:rPr>
-              <w:t>Water/sky elements, calm characters</w:t>
+              <w:t>Water/sky elements, calm characters, the Host</w:t>
             </w:r>
           </w:p>
         </w:tc>
@@ -1100,7 +1119,7 @@
                 <w:b w:val="0"/>
                 <w:sz w:val="17"/>
               </w:rPr>
-              <w:t>THE focal color — the key idea (sparingly)</w:t>
+              <w:t>THE focal color — the ONE key idea per frame (sparingly)</w:t>
             </w:r>
           </w:p>
         </w:tc>
@@ -1410,7 +1429,7 @@
                 <w:b w:val="0"/>
                 <w:sz w:val="17"/>
               </w:rPr>
-              <w:t>VideoScribe canvas / negative space</w:t>
+              <w:t>The VideoScribe canvas / negative space</w:t>
             </w:r>
           </w:p>
         </w:tc>
@@ -1472,7 +1491,7 @@
                 <w:b w:val="0"/>
                 <w:sz w:val="17"/>
               </w:rPr>
-              <w:t>Eyes / edge accents / fine detail — never pure black</w:t>
+              <w:t>Eyes, edge accents, fine detail — never pure black</w:t>
             </w:r>
           </w:p>
         </w:tc>
@@ -1487,15 +1506,7 @@
         <w:rPr>
           <w:sz w:val="21"/>
         </w:rPr>
-        <w:t>Bright but balanced: use the palette across elements; reserve TOMATO CORAL for the one focal element per frame (the key idea). Cream is the canvas. No pure black/white.</w:t>
-      </w:r>
-    </w:p>
-    <w:p>
-      <w:pPr>
-        <w:pStyle w:val="Heading2"/>
-      </w:pPr>
-      <w:r>
-        <w:t>4c. Characters</w:t>
+        <w:t>Bright but balanced: spread the palette across elements; let TOMATO CORAL spotlight the one key idea.</w:t>
       </w:r>
     </w:p>
     <w:p>
@@ -1506,9 +1517,143 @@
         <w:rPr>
           <w:sz w:val="21"/>
         </w:rPr>
-        <w:t>HOST (recurring narrator): one fixed friendly clip-art animal guide — recommended a rounded sky-blue fox with a coral scarf, dot eyes and rosy cheeks. Lock ONE design and reuse it identically as a saved Element.</w:t>
+        <w:t>Cream (#FBF7EF) is the canvas/background. No pure black/white — use Charcoal and Cream. Tints/shades of these colors are fine; brand-new colors are not.</w:t>
       </w:r>
     </w:p>
+    <w:p>
+      <w:pPr>
+        <w:pStyle w:val="Heading2"/>
+      </w:pPr>
+      <w:r>
+        <w:t>4d. Character anchors (describe with the SAME words every time)</w:t>
+      </w:r>
+    </w:p>
+    <w:p>
+      <w:r>
+        <w:rPr>
+          <w:i w:val="0"/>
+          <w:sz w:val="21"/>
+        </w:rPr>
+        <w:t>Re-stating these exact descriptions in every prompt is what keeps recurring characters identical across all videos. Save the Host (and any repeated prop) as a Higgsfield ELEMENT and reuse it — don't redraw it.</w:t>
+      </w:r>
+    </w:p>
+    <w:p>
+      <w:r>
+        <w:rPr>
+          <w:b/>
+          <w:color w:val="1F4E5F"/>
+          <w:sz w:val="19"/>
+        </w:rPr>
+        <w:t>HOST (recurring narrator — in every episode):</w:t>
+      </w:r>
+    </w:p>
+    <w:tbl>
+      <w:tblPr>
+        <w:tblStyle w:val="TableGrid"/>
+        <w:tblW w:type="auto" w:w="0"/>
+        <w:tblLook w:firstColumn="1" w:firstRow="1" w:lastColumn="0" w:lastRow="0" w:noHBand="0" w:noVBand="1" w:val="04A0"/>
+      </w:tblPr>
+      <w:tblGrid>
+        <w:gridCol w:w="8640"/>
+      </w:tblGrid>
+      <w:tr>
+        <w:tc>
+          <w:tcPr>
+            <w:tcW w:type="dxa" w:w="8640"/>
+            <w:shd w:val="clear" w:color="auto" w:fill="F2F4F0"/>
+          </w:tcPr>
+          <w:p>
+            <w:r/>
+            <w:r>
+              <w:rPr>
+                <w:rFonts w:ascii="Consolas" w:hAnsi="Consolas"/>
+                <w:sz w:val="18"/>
+              </w:rPr>
+              <w:t>cute clip-art fox host (rounded chunky sky-blue body, charcoal dot eyes, rosy cheeks, tomato-coral knitted scarf). Lock ONE design and reuse it identically as a saved Element.</w:t>
+            </w:r>
+          </w:p>
+        </w:tc>
+      </w:tr>
+    </w:tbl>
+    <w:p/>
+    <w:p>
+      <w:r>
+        <w:rPr>
+          <w:b/>
+          <w:color w:val="1F4E5F"/>
+          <w:sz w:val="19"/>
+        </w:rPr>
+        <w:t>ANIMAL OF THE WEEK (the episode's animal):</w:t>
+      </w:r>
+    </w:p>
+    <w:tbl>
+      <w:tblPr>
+        <w:tblStyle w:val="TableGrid"/>
+        <w:tblW w:type="auto" w:w="0"/>
+        <w:tblLook w:firstColumn="1" w:firstRow="1" w:lastColumn="0" w:lastRow="0" w:noHBand="0" w:noVBand="1" w:val="04A0"/>
+      </w:tblPr>
+      <w:tblGrid>
+        <w:gridCol w:w="8640"/>
+      </w:tblGrid>
+      <w:tr>
+        <w:tc>
+          <w:tcPr>
+            <w:tcW w:type="dxa" w:w="8640"/>
+            <w:shd w:val="clear" w:color="auto" w:fill="F2F4F0"/>
+          </w:tcPr>
+          <w:p>
+            <w:r/>
+            <w:r>
+              <w:rPr>
+                <w:rFonts w:ascii="Consolas" w:hAnsi="Consolas"/>
+                <w:sz w:val="18"/>
+              </w:rPr>
+              <w:t>the episode's animal as a cute clip-art character, RE-TINTED into the brand palette (NOT natural photo colors), rounded and friendly, simplified, dot eyes, rosy cheeks.</w:t>
+            </w:r>
+          </w:p>
+        </w:tc>
+      </w:tr>
+    </w:tbl>
+    <w:p/>
+    <w:p>
+      <w:r>
+        <w:rPr>
+          <w:b/>
+          <w:color w:val="1F4E5F"/>
+          <w:sz w:val="19"/>
+        </w:rPr>
+        <w:t>CROWDS / MARKETS / 'YOU':</w:t>
+      </w:r>
+    </w:p>
+    <w:tbl>
+      <w:tblPr>
+        <w:tblStyle w:val="TableGrid"/>
+        <w:tblW w:type="auto" w:w="0"/>
+        <w:tblLook w:firstColumn="1" w:firstRow="1" w:lastColumn="0" w:lastRow="0" w:noHBand="0" w:noVBand="1" w:val="04A0"/>
+      </w:tblPr>
+      <w:tblGrid>
+        <w:gridCol w:w="8640"/>
+      </w:tblGrid>
+      <w:tr>
+        <w:tc>
+          <w:tcPr>
+            <w:tcW w:type="dxa" w:w="8640"/>
+            <w:shd w:val="clear" w:color="auto" w:fill="F2F4F0"/>
+          </w:tcPr>
+          <w:p>
+            <w:r/>
+            <w:r>
+              <w:rPr>
+                <w:rFonts w:ascii="Consolas" w:hAnsi="Consolas"/>
+                <w:sz w:val="18"/>
+              </w:rPr>
+              <w:t>simple rounded clip-art person figure (sky-blue body, charcoal dot eyes, no other facial detail); a crowd is many identical figures, the odd-one-out is tomato coral.</w:t>
+            </w:r>
+          </w:p>
+        </w:tc>
+      </w:tr>
+    </w:tbl>
+    <w:p/>
     <w:p>
       <w:pPr>
         <w:pStyle w:val="ListBullet"/>
@@ -1517,7 +1662,7 @@
         <w:rPr>
           <w:sz w:val="21"/>
         </w:rPr>
-        <w:t>ANIMAL OF THE WEEK: the spreadsheet animal as a cute rounded clip-art character, RE-TINTED into the brand palette (not natural photo colors), simplified, friendly.</w:t>
+        <w:t>FINANCE MOTIFS: charts/coins/arrows as cute chunky clip-art in the palette (no stock screenshots); keep one icon vocabulary; each is its OWN isolated transparent element.</w:t>
       </w:r>
     </w:p>
     <w:p>
@@ -1528,7 +1673,7 @@
         <w:rPr>
           <w:sz w:val="21"/>
         </w:rPr>
-        <w:t>CROWDS / MARKETS / 'YOU': simple rounded clip-art figures in palette colors; the odd-one-out is coral.</w:t>
+        <w:t>COMPOSITION: element PNGs have no fixed aspect ratio; the 16:9 LAYOUT is built on the cream VideoScribe canvas — one clear focal subject per frame, bottom ~15% caption-safe.</w:t>
       </w:r>
     </w:p>
     <w:p>
@@ -1536,31 +1681,57 @@
         <w:pStyle w:val="Heading2"/>
       </w:pPr>
       <w:r>
-        <w:t>4d. Finance motifs &amp; composition</w:t>
+        <w:t>4e. Style tags (paste at the end of EVERY prompt)</w:t>
       </w:r>
     </w:p>
     <w:p>
-      <w:pPr>
-        <w:pStyle w:val="ListBullet"/>
-      </w:pPr>
       <w:r>
         <w:rPr>
+          <w:i w:val="0"/>
           <w:sz w:val="21"/>
         </w:rPr>
-        <w:t>Charts/coins/arrows drawn as cute chunky clip-art in the palette (no realistic stock screenshots). Keep one icon vocabulary. Each is its OWN isolated transparent element.</w:t>
+        <w:t>Append one verbatim so the look is locked: the COMPACT tag for normal per-element prompts; the FULL suffix for one-off hero elements. Full text of both, plus the NEGATIVE/AVOID list, is in the Appendix.</w:t>
       </w:r>
     </w:p>
     <w:p>
-      <w:pPr>
-        <w:pStyle w:val="ListBullet"/>
-      </w:pPr>
       <w:r>
         <w:rPr>
-          <w:sz w:val="21"/>
+          <w:b/>
+          <w:color w:val="1F4E5F"/>
+          <w:sz w:val="19"/>
         </w:rPr>
-        <w:t>Elements are individual assets (no fixed aspect ratio on the PNG). The 16:9 LAYOUT is composed on the VideoScribe canvas; one clear focal subject per frame; keep the bottom ~15% of the canvas caption-safe.</w:t>
+        <w:t>COMPACT STYLE TAG (the workhorse — append to every per-element prompt):</w:t>
       </w:r>
     </w:p>
+    <w:tbl>
+      <w:tblPr>
+        <w:tblStyle w:val="TableGrid"/>
+        <w:tblW w:type="auto" w:w="0"/>
+        <w:tblLook w:firstColumn="1" w:firstRow="1" w:lastColumn="0" w:lastRow="0" w:noHBand="0" w:noVBand="1" w:val="04A0"/>
+      </w:tblPr>
+      <w:tblGrid>
+        <w:gridCol w:w="8640"/>
+      </w:tblGrid>
+      <w:tr>
+        <w:tc>
+          <w:tcPr>
+            <w:tcW w:type="dxa" w:w="8640"/>
+            <w:shd w:val="clear" w:color="auto" w:fill="F2F4F0"/>
+          </w:tcPr>
+          <w:p>
+            <w:r/>
+            <w:r>
+              <w:rPr>
+                <w:rFonts w:ascii="Consolas" w:hAnsi="Consolas"/>
+                <w:sz w:val="18"/>
+              </w:rPr>
+              <w:t>STYLE: bright cheerful flat 2D vector children's-book clip-art; rounded cute friendly shapes, soft subtle shading + gentle highlights, thin minimal edge accents (no heavy black outlines); dot eyes, rosy cheeks; palette sunshine #FBC02D, sky #4FC3E8, leaf #7CC576, coral #F0654E, tangerine #F39237, blush #F6A9B6, stone #9DB0BC, brown #8D6E63, cream #FBF7EF, charcoal #3A3631; SINGLE isolated element, centered, TRANSPARENT background, no scene/no ground shadow; clean modern wholesome. No grain/gradient/3D/realistic/photoreal/heavy outline/clutter/scene-background.</w:t>
+            </w:r>
+          </w:p>
+        </w:tc>
+      </w:tr>
+    </w:tbl>
+    <w:p/>
     <w:p>
       <w:pPr>
         <w:pStyle w:val="Heading1"/>

</xml_diff>